<commit_message>
1Kings 2nd re-audit: 4 MSG omissions restored (EN/KO), GDocs 22/22 verified
</commit_message>
<xml_diff>
--- a/gdocs_build/1Kings.docx
+++ b/gdocs_build/1Kings.docx
@@ -8494,7 +8494,7 @@
               <w:rPr>
                 <w:sz w:val="18"/>
               </w:rPr>
-              <w:t>Okay, so get this: 480 years after the Israelites left Egypt, in the fourth year of Solomon's rule, in the month of Ziv (the second month), King Solomon started building the Temple of God. This thing was huge—like, 90 feet long, 30 feet wide, and 45 feet high. It had this cool 15-foot porch stretching across the front. Inside, the windows were these narrow, deep-set things. And on the outside, he built this whole support structure with extra rooms. The first floor rooms were 7.5 feet wide, the second 9 feet, and the third 10.5 feet. He even built these ledges on the outside to hold up the support beams. Pretty smart, right?</w:t>
+              <w:t>Okay, so get this: 480 years after the Israelites left Egypt, in the fourth year of Solomon's rule, in the month of Ziv (the second month), King Solomon started building the Temple of God. This thing was huge—like, 90 feet long, 30 feet wide, and 45 feet high. It had this cool 30-foot-wide porch stretching across the front, going out 15 feet. Inside, the windows were these narrow, deep-set things. And on the outside, he built this whole support structure with extra rooms. The first floor rooms were 7.5 feet wide, the second 9 feet, and the third 10.5 feet. He even built these ledges on the outside to hold up the support beams. Pretty smart, right?</w:t>
             </w:r>
           </w:p>
         </w:tc>
@@ -8517,7 +8517,7 @@
               <w:rPr>
                 <w:sz w:val="18"/>
               </w:rPr>
-              <w:t>자, 들어봐. 이스라엘 백성이 이집트에서 나온 지 480년이 지났을 때, 솔로몬이 이스라엘 왕이 된 지 4년째 되던 해, 시브월이라는 달에 솔로몬이 하나님의 성전을 짓기 시작했대. 솔로몬 왕이 하나님께 지어드린 성전은 길이가 90피트, 너비가 30피트, 높이가 45피트나 됐어. 성전 앞에는 30피트 너비의 현관이 15피트나 튀어나와 있었고. 성전 안에는 좁고 깊은 창문들을 만들었대. 바깥벽에는 작은 방들이 있는 지지 구조물을 지었는데, 아래층은 7.5피트, 중간층은 9피트, 3층은 10.5피트 너비였어. 심지어 바깥벽에 선반 같은 걸 만들어서 받침대를 지지하게 했대. 완전 똑똑하지?</w:t>
+              <w:t>자, 들어봐. 이스라엘 백성이 이집트에서 나온 지 480년이 지났을 때, 솔로몬이 이스라엘 왕이 된 지 4년째 되던 해, 시브월, 곧 두 번째 달에 솔로몬이 하나님의 성전을 짓기 시작했대. 솔로몬 왕이 하나님께 지어드린 성전은 길이가 90피트, 너비가 30피트, 높이가 45피트나 됐어. 성전 앞에는 30피트 너비의 현관이 15피트나 튀어나와 있었고. 성전 안에는 좁고 깊은 창문들을 만들었대. 바깥벽에는 작은 방들이 있는 지지 구조물을 지었는데, 아래층은 7.5피트, 중간층은 9피트, 3층은 10.5피트 너비였어. 심지어 바깥벽에 선반 같은 걸 만들어서 받침대를 지지하게 했대. 완전 똑똑하지?</w:t>
             </w:r>
           </w:p>
         </w:tc>
@@ -18043,7 +18043,7 @@
               <w:rPr>
                 <w:sz w:val="18"/>
               </w:rPr>
-              <w:t>But then, God spoke to a man of God named Shemaiah: "Tell Rehoboam son of Solomon, king of Judah, and everyone in Judah and Benjamin: God says, 'Don't go fight your own relatives, the Israelites. Everyone go home. I'm in control here.'" And they actually listened. They did what God said and went home.</w:t>
+              <w:t>But then, God spoke to a man of God named Shemaiah: "Tell Rehoboam son of Solomon, king of Judah, and everyone in Judah and Benjamin, and anyone else who's around: God says, 'Don't go fight your own relatives, the Israelites. Everyone go home. I'm in control here.'" And they actually listened. They did what God said and went home.</w:t>
             </w:r>
           </w:p>
         </w:tc>
@@ -18327,7 +18327,7 @@
               <w:rPr>
                 <w:sz w:val="18"/>
               </w:rPr>
-              <w:t>And it didn't stop there. Jeroboam built a bunch of unauthorized shrines all over and made priests out of anyone he could find, whether they were qualified or not. To top it all off, he made up his own holiday on the fifteenth day of the eighth month to compete with the festival in Judah. He even led the worship himself at the altar in Bethel, sacrificing to the calves he had made. This whole thing was his own idea, a festival just for Israel, with him at the center of it all.</w:t>
+              <w:t>And it didn't stop there. Jeroboam built a bunch of unauthorized shrines all over and made priests out of anyone he could find, whether they were qualified or not. To top it all off, he made up his own holy New Year holiday on the fifteenth day of the eighth month to compete with the festival in Judah. He even led the worship himself at the altar in Bethel, sacrificing to the calves he had made. He staffed Bethel with priests from the local shrines he had made. This whole thing was his own idea, a festival just for Israel, with him at the center of it all.</w:t>
             </w:r>
           </w:p>
         </w:tc>

</xml_diff>